<commit_message>
last update of ch 17
</commit_message>
<xml_diff>
--- a/docs/lectures/Chapter17_Lecture.docx
+++ b/docs/lectures/Chapter17_Lecture.docx
@@ -23,7 +23,7 @@
         <w:pStyle w:val="Date"/>
       </w:pPr>
       <w:r>
-        <w:t xml:space="preserve">2026-04-22</w:t>
+        <w:t xml:space="preserve">2026-04-23</w:t>
       </w:r>
     </w:p>
     <w:sdt>
@@ -5096,7 +5096,11 @@
         <w:pStyle w:val="FirstParagraph"/>
       </w:pPr>
       <w:r>
-        <w:t xml:space="preserve">The obsolescing bargain principle is extremely important. At the beginning of a project, the foreign investor may have strong bargaining power because the host country wants capital, expertise, and technology. But once the investor has sunk capital into the project - once the bricks, mortar, equipment, and networks are in place - bargaining power often shifts toward the host country.</w:t>
+        <w:rPr>
+          <w:b/>
+          <w:bCs/>
+        </w:rPr>
+        <w:t xml:space="preserve">The obsolescing bargain principle is extremely important. At the beginning of a project, the foreign investor may have strong bargaining power because the host country wants capital, expertise, and technology. But once the investor has sunk capital into the project - once the bricks, mortar, equipment, and networks are in place - bargaining power often shifts toward the host country. (think Tesla in China)</w:t>
       </w:r>
     </w:p>
     <w:p>

</xml_diff>